<commit_message>
docs: fiqh.docx regenere post-v1499 (jours 4,8,64,66,80 corriges)
Co-Authored-By: Claude Opus 4.6 (1M context) <noreply@anthropic.com>
</commit_message>
<xml_diff>
--- a/ECRITS_NIYYAH/fiqh.docx
+++ b/ECRITS_NIYYAH/fiqh.docx
@@ -485,7 +485,7 @@
           <w:sz w:val="20"/>
           <w:szCs w:val="20"/>
         </w:rPr>
-        <w:t xml:space="preserve">Hadith Abu Dawud 101 / Divergence d'écoles</w:t>
+        <w:t xml:space="preserve">Hadith Abu Dawud 1012, Ibn Majah 399 / Divergence d'écoles</w:t>
       </w:r>
     </w:p>
     <w:p>
@@ -4138,7 +4138,7 @@
           <w:sz w:val="22"/>
           <w:szCs w:val="22"/>
         </w:rPr>
-        <w:t xml:space="preserve">Tous les takbirs intermédiaires (autres que celui d'ouverture) sont des actes obligatoires.</w:t>
+        <w:t xml:space="preserve">Tous les takbirs intermédiaires (autres que celui d'ouverture) sont des actes obligatoires selon les Hanbalites, sunnah confirmée pour les autres écoles.</w:t>
       </w:r>
     </w:p>
     <w:p>
@@ -4268,7 +4268,7 @@
           <w:sz w:val="22"/>
           <w:szCs w:val="22"/>
         </w:rPr>
-        <w:t xml:space="preserve">Les invocations dans le rukû' (Subhana Rabbiya al-'Adhim) et dans le sujûd (Subhana Rabbiya al-A'la) sont obligatoires.</w:t>
+        <w:t xml:space="preserve">Les invocations dans le rukû' (Subhana Rabbiya al-'Adhim) et dans le sujûd (Subhana Rabbiya al-A'la) sont obligatoires selon les Hanbalites, sunnah fortement recommandée pour les Hanafites, Malikites et Shafi’ites.</w:t>
       </w:r>
     </w:p>
     <w:p>

</xml_diff>